<commit_message>
Migrate OpenClaw package to Radware npm scope
</commit_message>
<xml_diff>
--- a/output/doc/OpenClaw Radware Agentic AI Protection Integration Guide.docx
+++ b/output/doc/OpenClaw Radware Agentic AI Protection Integration Guide.docx
@@ -66,11 +66,11 @@
       <w:r>
         <w:t>Written by: Sean Ramati</w:t>
         <w:br/>
-        <w:t>Version 1.1</w:t>
+        <w:t>Version 1.2</w:t>
         <w:br/>
-        <w:t>June 29, 2026</w:t>
+        <w:t>June 30, 2026</w:t>
         <w:br/>
-        <w:t>NPM package: openclaw-radware-agentic-protection@0.2.0</w:t>
+        <w:t>NPM package: @radware/openclaw-radware-agentic-protection@0.2.2</w:t>
       </w:r>
     </w:p>
     <w:p>
@@ -167,20 +167,8 @@
     </w:p>
     <w:p>
       <w:r>
-        <w:rPr>
-          <w:b/>
-        </w:rPr>
-        <w:t xml:space="preserve">NPM: </w:t>
+        <w:t>NPM: npmjs.com/package/@radware/openclaw-radware-agentic-protection</w:t>
       </w:r>
-      <w:hyperlink r:id="rId12">
-        <w:r>
-          <w:rPr>
-            <w:color w:val="E2231A"/>
-            <w:u w:val="single"/>
-          </w:rPr>
-          <w:t>npmjs.com/package/openclaw-radware-agentic-protection</w:t>
-        </w:r>
-      </w:hyperlink>
     </w:p>
     <w:p>
       <w:pPr>
@@ -387,7 +375,7 @@
         <w:pStyle w:val="NoSpacing"/>
       </w:pPr>
       <w:r>
-        <w:t>2. Run one command: npx -y -p openclaw-radware-agentic-protection@latest radware-openclaw-setup</w:t>
+        <w:t>2. Run one command: npx -y -p @radware/openclaw-radware-agentic-protection@latest radware-openclaw-setup</w:t>
       </w:r>
     </w:p>
     <w:p>
@@ -423,7 +411,7 @@
         <w:pStyle w:val="NoSpacing"/>
       </w:pPr>
       <w:r>
-        <w:t>npx -y -p openclaw-radware-agentic-protection@latest radware-openclaw-setup</w:t>
+        <w:t>npx -y -p @radware/openclaw-radware-agentic-protection@latest radware-openclaw-setup</w:t>
       </w:r>
     </w:p>
     <w:p>
@@ -431,7 +419,7 @@
         <w:pStyle w:val="NoSpacing"/>
       </w:pPr>
       <w:r>
-        <w:t>openclaw plugins install npm:openclaw-radware-agentic-protection@latest</w:t>
+        <w:t>openclaw plugins install npm:@radware/openclaw-radware-agentic-protection@latest</w:t>
       </w:r>
     </w:p>
     <w:p>
@@ -455,7 +443,7 @@
         <w:pStyle w:val="ListBullet"/>
       </w:pPr>
       <w:r>
-        <w:t>Use openclaw-radware-agentic-protection@latest in customer-facing commands.</w:t>
+        <w:t>Use @radware/openclaw-radware-agentic-protection@latest in customer-facing commands.</w:t>
       </w:r>
     </w:p>
     <w:p>
@@ -463,7 +451,7 @@
         <w:pStyle w:val="ListBullet"/>
       </w:pPr>
       <w:r>
-        <w:t>Version 0.2.0 is the customer release version for the interactive wizard, full-stage out-of-path enforcement, sanitized diagnostics, and strict one-path-per-OpenClaw deployment guardrails.</w:t>
+        <w:t>Version 0.2.2 is the scoped Radware package release for the interactive wizard, custom in-path provider endpoints, full-stage out-of-path enforcement, sanitized diagnostics, and strict one-path-per-OpenClaw deployment guardrails. Keep the legacy unscoped package available as a migration pointer and deprecate it only from an npm account that owns that package; do not delete it as normal maintenance.</w:t>
       </w:r>
     </w:p>
     <w:p>
@@ -608,20 +596,8 @@
     </w:p>
     <w:p>
       <w:r>
-        <w:rPr>
-          <w:b/>
-        </w:rPr>
-        <w:t xml:space="preserve">NPM package: </w:t>
+        <w:t>NPM package: https://www.npmjs.com/package/@radware/openclaw-radware-agentic-protection</w:t>
       </w:r>
-      <w:hyperlink r:id="rId14">
-        <w:r>
-          <w:rPr>
-            <w:color w:val="E2231A"/>
-            <w:u w:val="single"/>
-          </w:rPr>
-          <w:t>https://www.npmjs.com/package/openclaw-radware-agentic-protection</w:t>
-        </w:r>
-      </w:hyperlink>
     </w:p>
     <w:sectPr>
       <w:headerReference w:type="default" r:id="rId15"/>

</xml_diff>